<commit_message>
Assign deterministic relationship ids to added parts and links
A part or relationship added without an id was given a random one by the
Open XML SDK, so output with a markdown link, a list on a template with
no numbering part, newly created document property parts, an image part
or the built-in style source was not byte-identical between renders.

Every add now takes its id from RelationshipIds, which picks a fixed or
sequential id that steps past the ids the owning part already holds.
Markdown links to the same target share one relationship.
</commit_message>
<xml_diff>
--- a/src/Parchment.Tests/NaughtyStringsTests.DocxFilterMarkdown.verified.docx
+++ b/src/Parchment.Tests/NaughtyStringsTests.DocxFilterMarkdown.verified.docx
@@ -2944,7 +2944,7 @@
       </w:r>
     </w:p>
     <w:p>
-      <w:hyperlink xmlns:r="http://schemas.openxmlformats.org/officeDocument/2006/relationships" r:id="DeterministicId3">
+      <w:hyperlink xmlns:r="http://schemas.openxmlformats.org/officeDocument/2006/relationships" r:id="DeterministicId2">
         <w:r>
           <w:rPr>
             <w:rStyle w:val="Hyperlink"/>
@@ -3099,7 +3099,7 @@
       <w:r>
         <w:t xml:space="preserve">()</w:t>
       </w:r>
-      <w:hyperlink xmlns:r="http://schemas.openxmlformats.org/officeDocument/2006/relationships" r:id="DeterministicId2">
+      <w:hyperlink xmlns:r="http://schemas.openxmlformats.org/officeDocument/2006/relationships" r:id="DeterministicId1">
         <w:r>
           <w:rPr>
             <w:rStyle w:val="Hyperlink"/>

</xml_diff>

<commit_message>
Assign deterministic relationship ids to added parts and links (#109)
A part or relationship added without an id was given a random one by the
Open XML SDK, so output with a markdown link, a list on a template with
no numbering part, newly created document property parts, an image part
or the built-in style source was not byte-identical between renders.

Every add now takes its id from RelationshipIds, which picks a fixed or
sequential id that steps past the ids the owning part already holds.
Markdown links to the same target share one relationship.
</commit_message>
<xml_diff>
--- a/src/Parchment.Tests/NaughtyStringsTests.DocxFilterMarkdown.verified.docx
+++ b/src/Parchment.Tests/NaughtyStringsTests.DocxFilterMarkdown.verified.docx
@@ -2944,7 +2944,7 @@
       </w:r>
     </w:p>
     <w:p>
-      <w:hyperlink xmlns:r="http://schemas.openxmlformats.org/officeDocument/2006/relationships" r:id="DeterministicId3">
+      <w:hyperlink xmlns:r="http://schemas.openxmlformats.org/officeDocument/2006/relationships" r:id="DeterministicId2">
         <w:r>
           <w:rPr>
             <w:rStyle w:val="Hyperlink"/>
@@ -3099,7 +3099,7 @@
       <w:r>
         <w:t xml:space="preserve">()</w:t>
       </w:r>
-      <w:hyperlink xmlns:r="http://schemas.openxmlformats.org/officeDocument/2006/relationships" r:id="DeterministicId2">
+      <w:hyperlink xmlns:r="http://schemas.openxmlformats.org/officeDocument/2006/relationships" r:id="DeterministicId1">
         <w:r>
           <w:rPr>
             <w:rStyle w:val="Hyperlink"/>

</xml_diff>

<commit_message>
Render entities, unmatched delimiters and angle quotes in markdown
Markdig writes nothing for a leaf inline no renderer accepts, and only the
children of a container, without raising anything. No renderer was
registered for HtmlEntityInline or DelimiterInline, and four smarty pants
kinds had no glyph, so AT&amp;T rendered as "ATT", an unclosed [ and a
pipe inside emphasis vanished, and <<x>> lost its quotes.

Register a renderer for each, map every smarty pants kind, and give the
image alt text walk the same inlines. A reflection test holds the
renderer list to the inlines the configured pipeline can produce.
</commit_message>
<xml_diff>
--- a/src/Parchment.Tests/NaughtyStringsTests.DocxFilterMarkdown.verified.docx
+++ b/src/Parchment.Tests/NaughtyStringsTests.DocxFilterMarkdown.verified.docx
@@ -353,7 +353,7 @@
         <w:rPr>
           <w:i/>
         </w:rPr>
-        <w:t xml:space="preserve">'&gt;&lt;script&gt;\xC2\xA0javascript:alert(164)&lt;/script&gt; | &lt;img \x00src=x onerror="alert(165)"&gt; | &lt;img \x47src=x onerror="javascript:alert(166)"&gt; | &lt;img \x11src=x onerror="javascript:alert(167)"&gt; | &lt;img \x12src=x onerror="javascript:alert(168)"&gt; | &lt;img\x47src=x onerror="javascript:alert(169)"&gt; | &lt;img\x10src=x onerror="javascript:alert(170)"&gt; | &lt;img\x13src=x onerror="javascript:alert(171)"&gt; | &lt;img\x32src=x onerror="javascript:alert(172)"&gt; | &lt;img\x47src=x onerror="javascript:alert(173)"&gt; | &lt;img\x11src=x onerror="javascript:alert(174)"&gt; | &lt;img \x47src=x onerror="javascript:alert(175)"&gt; | &lt;img \x34src=x onerror="javascript:alert(176)"&gt; | &lt;img \x39src=x onerror="javascript:alert(177)"&gt; | &lt;img \x00src=x onerror="javascript:alert(178)"&gt; | &lt;img src\x09=x onerror="javascript:alert(179)"&gt; | &lt;img src\x10=x onerror="javascript:alert(180)"&gt; | &lt;img src\x13=x onerror="javascript:alert(181)"&gt; | &lt;img src\x32=x onerror="javascript:alert(182)"&gt; | &lt;img src\x12=x onerror="javascript:alert(183)"&gt; | &lt;img src\x11=x onerror="javascript:alert(184)"&gt; | &lt;img src\x00=x onerror="javascript:alert(185)"&gt; | &lt;img src\x47=x onerror="javascript:alert(186)"&gt; | &lt;img src=x\x09onerror="javascript:alert(187)"&gt; | &lt;img src=x\x10onerror="javascript:alert(188)"&gt; | &lt;img src=x\x11onerror="javascript:alert(189)"&gt; | &lt;img src=x\x12onerror="javascript:alert(190)"&gt; | &lt;img src=x\x13onerror="javascript:alert(191)"&gt; | &lt;img[a]b][c]src[d]=x[e]onerror=[f]"alert(192)"&gt; | &lt;img src=x onerror=\x09"javascript:alert(193)"&gt; | &lt;img src=x onerror=\x10"javascript:alert(194)"&gt; | &lt;img src=x onerror=\x11"javascript:alert(195)"&gt; | &lt;img src=x onerror=\x12"javascript:alert(196)"&gt; | &lt;img src=x onerror=\x32"javascript:alert(197)"&gt; | &lt;img src=x onerror=\x00"javascript:alert(198)"&gt; | &lt;a href=java&amp;#1&amp;#2&amp;#3&amp;#4&amp;#5&amp;#6&amp;#7&amp;#8&amp;#11&amp;#12script:javascript:alert(199)&gt;XXX&lt;/a&gt; | &lt;img src=“x</w:t>
+        <w:t xml:space="preserve">'&gt;&lt;script&gt;\xC2\xA0javascript:alert(164)&lt;/script&gt; | &lt;img \x00src=x onerror="alert(165)"&gt; | &lt;img \x47src=x onerror="javascript:alert(166)"&gt; | &lt;img \x11src=x onerror="javascript:alert(167)"&gt; | &lt;img \x12src=x onerror="javascript:alert(168)"&gt; | &lt;img\x47src=x onerror="javascript:alert(169)"&gt; | &lt;img\x10src=x onerror="javascript:alert(170)"&gt; | &lt;img\x13src=x onerror="javascript:alert(171)"&gt; | &lt;img\x32src=x onerror="javascript:alert(172)"&gt; | &lt;img\x47src=x onerror="javascript:alert(173)"&gt; | &lt;img\x11src=x onerror="javascript:alert(174)"&gt; | &lt;img \x47src=x onerror="javascript:alert(175)"&gt; | &lt;img \x34src=x onerror="javascript:alert(176)"&gt; | &lt;img \x39src=x onerror="javascript:alert(177)"&gt; | &lt;img \x00src=x onerror="javascript:alert(178)"&gt; | &lt;img src\x09=x onerror="javascript:alert(179)"&gt; | &lt;img src\x10=x onerror="javascript:alert(180)"&gt; | &lt;img src\x13=x onerror="javascript:alert(181)"&gt; | &lt;img src\x32=x onerror="javascript:alert(182)"&gt; | &lt;img src\x12=x onerror="javascript:alert(183)"&gt; | &lt;img src\x11=x onerror="javascript:alert(184)"&gt; | &lt;img src\x00=x onerror="javascript:alert(185)"&gt; | &lt;img src\x47=x onerror="javascript:alert(186)"&gt; | &lt;img src=x\x09onerror="javascript:alert(187)"&gt; | &lt;img src=x\x10onerror="javascript:alert(188)"&gt; | &lt;img src=x\x11onerror="javascript:alert(189)"&gt; | &lt;img src=x\x12onerror="javascript:alert(190)"&gt; | &lt;img src=x\x13onerror="javascript:alert(191)"&gt; | &lt;img[a][b][c]src[d]=x[e]onerror=[f]"alert(192)"&gt; | &lt;img src=x onerror=\x09"javascript:alert(193)"&gt; | &lt;img src=x onerror=\x10"javascript:alert(194)"&gt; | &lt;img src=x onerror=\x11"javascript:alert(195)"&gt; | &lt;img src=x onerror=\x12"javascript:alert(196)"&gt; | &lt;img src=x onerror=\x32"javascript:alert(197)"&gt; | &lt;img src=x onerror=\x00"javascript:alert(198)"&gt; | &lt;a href=java&amp;#1&amp;#2&amp;#3&amp;#4&amp;#5&amp;#6&amp;#7&amp;#8&amp;#11&amp;#12script:javascript:alert(199)&gt;XXX&lt;/a&gt; | &lt;img src=“x</w:t>
       </w:r>
       <w:r>
         <w:rPr>
@@ -422,7 +422,7 @@
         <w:t xml:space="preserve">; } &gt;</w:t>
       </w:r>
       <w:r>
-        <w:t xml:space="preserve">[$($())] { touch /tmp/blns.shellshock2.fail; } | &lt;&lt;&lt; %s(un='%s’) = %u | +++ATH0 | CON | PRN | AUX | CLOCK$ | NUL | A: | ZZ: | COM1 | LPT1 | LPT2 | LPT3 | COM2 | COM3 | COM4 | DCC SEND STARTKEYLOGGER 0 0 0 | Scunthorpe General Hospital | Penistone Community Church | Lightwater Country Park | Jimmy Clitheroe | Horniman Museum | shitake mushrooms | RomansInSussex.co.uk | http://www.cum.qc.ca/ | Craig Cockburn, Software Specialist | Linda Callahan | Dr. Herman I. Libshitz | magna cum laude | Super Bowl XXX | medieval erection of parapets | evaluate | mocha | expression | Arsenal canal | classic | Tyson Gay | Dick Van Dyke | basement | If you're reading this, you've been in a coma for almost 20 years now. We're trying a new technique. We don't know where this message will end up in your dream, but we hope it works. Please wake up, we miss you. | Roses are 0;31mred0m, violets are 0;34mblue. Hope you enjoy terminal hue | But now...20Cfor my greatest trick...8m | The quick brown fox… [Beeeep] | Powerلُلُصّبُلُلصّبُررً ॣ ॣh ॣ ॣ冗 | 🏳0🌈️ | జ్ఞ‌ా | گچپژ | {% print ‘x’ * 64 * 1024**3 %} | {{ "".</w:t>
+        <w:t xml:space="preserve">[$($())] { touch /tmp/blns.shellshock2.fail; } | &lt;&lt;&lt; %s(un='%s’) = %u | +++ATH0 | CON | PRN | AUX | CLOCK$ | NUL | A: | ZZ: | COM1 | LPT1 | LPT2 | LPT3 | COM2 | COM3 | COM4 | DCC SEND STARTKEYLOGGER 0 0 0 | Scunthorpe General Hospital | Penistone Community Church | Lightwater Country Park | Jimmy Clitheroe | Horniman Museum | shitake mushrooms | RomansInSussex.co.uk | http://www.cum.qc.ca/ | Craig Cockburn, Software Specialist | Linda Callahan | Dr. Herman I. Libshitz | magna cum laude | Super Bowl XXX | medieval erection of parapets | evaluate | mocha | expression | Arsenal canal | classic | Tyson Gay | Dick Van Dyke | basement | If you're reading this, you've been in a coma for almost 20 years now. We're trying a new technique. We don't know where this message will end up in your dream, but we hope it works. Please wake up, we miss you. | Roses are [0;31mred[0m, violets are [0;34mblue. Hope you enjoy terminal hue | But now...[20Cfor my greatest trick...[8m | The quick brown fox… [Beeeep] | Powerلُلُصّبُلُلصّبُررً ॣ ॣh ॣ ॣ冗 | 🏳0🌈️ | జ్ఞ‌ా | گچپژ | {% print ‘x’ * 64 * 1024**3 %} | {{ "".</w:t>
       </w:r>
       <w:r>
         <w:rPr>
@@ -1510,7 +1510,7 @@
     <w:p/>
     <w:p>
       <w:r>
-        <w:t xml:space="preserve">scriptalert(1);/script</w:t>
+        <w:t xml:space="preserve">&lt;script&gt;alert('1');&lt;/script&gt;</w:t>
       </w:r>
     </w:p>
     <w:p/>
@@ -2461,7 +2461,7 @@
     </w:p>
     <w:p>
       <w:r>
-        <w:t xml:space="preserve">&lt;img[a]b][c]src[d]=x[e]onerror=[f]"alert(192)"&gt;</w:t>
+        <w:t xml:space="preserve">&lt;img[a][b][c]src[d]=x[e]onerror=[f]"alert(192)"&gt;</w:t>
       </w:r>
     </w:p>
     <w:p>
@@ -3030,12 +3030,12 @@
     </w:p>
     <w:p>
       <w:r>
-        <w:t xml:space="preserve">Roses are 0;31mred0m, violets are 0;34mblue. Hope you enjoy terminal hue</w:t>
-      </w:r>
-    </w:p>
-    <w:p>
-      <w:r>
-        <w:t xml:space="preserve">But now...20Cfor my greatest trick...8m</w:t>
+        <w:t xml:space="preserve">Roses are [0;31mred[0m, violets are [0;34mblue. Hope you enjoy terminal hue</w:t>
+      </w:r>
+    </w:p>
+    <w:p>
+      <w:r>
+        <w:t xml:space="preserve">But now...[20Cfor my greatest trick...[8m</w:t>
       </w:r>
     </w:p>
     <w:p>

</xml_diff>

<commit_message>
Render a markdown link with an unusable destination as text
A destination that does not parse as a url, such as a bound value of http://, reached new Uri when the hyperlink relationship was created and threw UriFormatException out of the render. Only an absolute url now becomes a hyperlink, the rule OpenXmlHtml applies to an html link; anything else, relative destinations included, is written as the link text followed by the destination in parentheses.
</commit_message>
<xml_diff>
--- a/src/Parchment.Tests/NaughtyStringsTests.DocxFilterMarkdown.verified.docx
+++ b/src/Parchment.Tests/NaughtyStringsTests.DocxFilterMarkdown.verified.docx
@@ -449,18 +449,7 @@
         <w:t xml:space="preserve">subclasses</w:t>
       </w:r>
       <w:r>
-        <w:t xml:space="preserve">()</w:t>
-      </w:r>
-      <w:hyperlink xmlns:r="http://schemas.openxmlformats.org/officeDocument/2006/relationships" r:id="DeterministicId1">
-        <w:r>
-          <w:rPr>
-            <w:rStyle w:val="Hyperlink"/>
-          </w:rPr>
-          <w:t xml:space="preserve">40</w:t>
-        </w:r>
-      </w:hyperlink>
-      <w:r>
-        <w:t xml:space="preserve">.read() }} | En dash – | Em dash — | Horizontal bar ― | Figure dash ‒ | Swung dash ⁓ | Single opening quote ‘ | Single closing quote ’ | Double opening quote “ | Double closing quote ” | Copyright © | Registered ® | Trademark ™ | Section § | Paragraph ¶ | Ellipsis … | Optional hyphen ¬ | Non-breaking hyphen ߛ | Em space ߓ | En space ߒ | Quarter space ߕ</w:t>
+        <w:t xml:space="preserve">()40 ("/etc/passwd").read() }} | En dash – | Em dash — | Horizontal bar ― | Figure dash ‒ | Swung dash ⁓ | Single opening quote ‘ | Single closing quote ’ | Double opening quote “ | Double closing quote ” | Copyright © | Registered ® | Trademark ™ | Section § | Paragraph ¶ | Ellipsis … | Optional hyphen ¬ | Non-breaking hyphen ߛ | Em space ߓ | En space ߒ | Quarter space ߕ</w:t>
       </w:r>
     </w:p>
     <w:p>
@@ -2944,7 +2933,7 @@
       </w:r>
     </w:p>
     <w:p>
-      <w:hyperlink xmlns:r="http://schemas.openxmlformats.org/officeDocument/2006/relationships" r:id="DeterministicId2">
+      <w:hyperlink xmlns:r="http://schemas.openxmlformats.org/officeDocument/2006/relationships" r:id="DeterministicId1">
         <w:r>
           <w:rPr>
             <w:rStyle w:val="Hyperlink"/>
@@ -3097,18 +3086,7 @@
         <w:t xml:space="preserve">subclasses</w:t>
       </w:r>
       <w:r>
-        <w:t xml:space="preserve">()</w:t>
-      </w:r>
-      <w:hyperlink xmlns:r="http://schemas.openxmlformats.org/officeDocument/2006/relationships" r:id="DeterministicId1">
-        <w:r>
-          <w:rPr>
-            <w:rStyle w:val="Hyperlink"/>
-          </w:rPr>
-          <w:t xml:space="preserve">40</w:t>
-        </w:r>
-      </w:hyperlink>
-      <w:r>
-        <w:t xml:space="preserve">.read() }}</w:t>
+        <w:t xml:space="preserve">()40 ("/etc/passwd").read() }}</w:t>
       </w:r>
     </w:p>
     <w:p>

</xml_diff>

<commit_message>
Give every list item its marker and keep html indents in schema order
A list item with no paragraph of its own (empty, whitespace only, or holding only a nested list, table, code block or html) produced no numbered paragraph, so its bullet vanished and an ordered list numbered later items one too low. Such an item now gets an empty numbered paragraph ahead of its other blocks.

The indent given to html inside a list item or block quote was appended to the converted pPr or tblPr, landing after w:jc or the table borders and failing schema validation. It is now set through the typed properties, and an html list starts from its numbering level's indent so its markers stay inside the container.

The NaughtyStrings snapshots change because some of their list items are empty.
</commit_message>
<xml_diff>
--- a/src/Parchment.Tests/NaughtyStringsTests.DocxFilterMarkdown.verified.docx
+++ b/src/Parchment.Tests/NaughtyStringsTests.DocxFilterMarkdown.verified.docx
@@ -744,6 +744,16 @@
       </w:r>
     </w:p>
     <w:p>
+      <w:pPr>
+        <w:pStyle w:val="ListParagraph"/>
+        <w:numPr>
+          <w:ilvl w:val="0"/>
+          <w:numId w:val="1"/>
+        </w:numPr>
+        <w:contextualSpacing/>
+      </w:pPr>
+    </w:p>
+    <w:p>
       <w:r>
         <w:t xml:space="preserve">-.</w:t>
       </w:r>
@@ -2664,6 +2674,16 @@
       <w:r>
         <w:t xml:space="preserve">_</w:t>
       </w:r>
+    </w:p>
+    <w:p>
+      <w:pPr>
+        <w:pStyle w:val="ListParagraph"/>
+        <w:numPr>
+          <w:ilvl w:val="0"/>
+          <w:numId w:val="2"/>
+        </w:numPr>
+        <w:contextualSpacing/>
+      </w:pPr>
     </w:p>
     <w:p>
       <w:r>

</xml_diff>

<commit_message>
Give every list item its marker and keep html indents in schema order (#237)
A list item with no paragraph of its own (empty, whitespace only, or holding only a nested list, table, code block or html) produced no numbered paragraph, so its bullet vanished and an ordered list numbered later items one too low. Such an item now gets an empty numbered paragraph ahead of its other blocks.

The indent given to html inside a list item or block quote was appended to the converted pPr or tblPr, landing after w:jc or the table borders and failing schema validation. It is now set through the typed properties, and an html list starts from its numbering level's indent so its markers stay inside the container.

The NaughtyStrings snapshots change because some of their list items are empty.
</commit_message>
<xml_diff>
--- a/src/Parchment.Tests/NaughtyStringsTests.DocxFilterMarkdown.verified.docx
+++ b/src/Parchment.Tests/NaughtyStringsTests.DocxFilterMarkdown.verified.docx
@@ -744,6 +744,16 @@
       </w:r>
     </w:p>
     <w:p>
+      <w:pPr>
+        <w:pStyle w:val="ListParagraph"/>
+        <w:numPr>
+          <w:ilvl w:val="0"/>
+          <w:numId w:val="1"/>
+        </w:numPr>
+        <w:contextualSpacing/>
+      </w:pPr>
+    </w:p>
+    <w:p>
       <w:r>
         <w:t xml:space="preserve">-.</w:t>
       </w:r>
@@ -2664,6 +2674,16 @@
       <w:r>
         <w:t xml:space="preserve">_</w:t>
       </w:r>
+    </w:p>
+    <w:p>
+      <w:pPr>
+        <w:pStyle w:val="ListParagraph"/>
+        <w:numPr>
+          <w:ilvl w:val="0"/>
+          <w:numId w:val="2"/>
+        </w:numPr>
+        <w:contextualSpacing/>
+      </w:pPr>
     </w:p>
     <w:p>
       <w:r>

</xml_diff>

<commit_message>
Accept snapshot changes from Morph 1.23.4 rendering
</commit_message>
<xml_diff>
--- a/src/Parchment.Tests/NaughtyStringsTests.DocxFilterMarkdown.verified.docx
+++ b/src/Parchment.Tests/NaughtyStringsTests.DocxFilterMarkdown.verified.docx
@@ -934,7 +934,7 @@
     </w:p>
     <w:p>
       <w:r>
-        <w:t xml:space="preserve">\t \u0085             ​\u2028\u2029</w:t>
+        <w:t xml:space="preserve">\t \u0085             ​\u2028\u2029  　</w:t>
       </w:r>
     </w:p>
     <w:p>
@@ -1545,7 +1545,7 @@
     </w:p>
     <w:p>
       <w:r>
-        <w:t xml:space="preserve">onfocus=JaVaSCript:alert(9) autofocus</w:t>
+        <w:t xml:space="preserve"> onfocus=JaVaSCript:alert(9) autofocus</w:t>
       </w:r>
     </w:p>
     <w:p>

</xml_diff>